<commit_message>
resolve: accept remote docx
</commit_message>
<xml_diff>
--- a/projects/paper-02/06-write/paper02_draft_v1.docx
+++ b/projects/paper-02/06-write/paper02_draft_v1.docx
@@ -4,6 +4,7 @@
   <w:body>
     <w:p>
       <w:pPr>
+        <w:spacing w:before="1440" w:after="240"/>
         <w:jc w:val="center"/>
         <w:spacing w:line="480" w:lineRule="auto"/>
       </w:pPr>
@@ -20,6 +21,7 @@
     </w:p>
     <w:p>
       <w:pPr>
+        <w:spacing w:before="0" w:after="80"/>
         <w:jc w:val="center"/>
         <w:spacing w:line="480" w:lineRule="auto"/>
       </w:pPr>
@@ -36,6 +38,7 @@
     </w:p>
     <w:p>
       <w:pPr>
+        <w:spacing w:before="0" w:after="80"/>
         <w:jc w:val="center"/>
         <w:spacing w:line="480" w:lineRule="auto"/>
       </w:pPr>
@@ -52,6 +55,7 @@
     </w:p>
     <w:p>
       <w:pPr>
+        <w:spacing w:before="0" w:after="80"/>
         <w:jc w:val="center"/>
         <w:spacing w:line="480" w:lineRule="auto"/>
       </w:pPr>
@@ -68,6 +72,7 @@
     </w:p>
     <w:p>
       <w:pPr>
+        <w:spacing w:before="0" w:after="80"/>
         <w:jc w:val="center"/>
         <w:spacing w:line="480" w:lineRule="auto"/>
       </w:pPr>
@@ -84,6 +89,7 @@
     </w:p>
     <w:p>
       <w:pPr>
+        <w:spacing w:before="0" w:after="80"/>
         <w:jc w:val="center"/>
         <w:spacing w:line="480" w:lineRule="auto"/>
       </w:pPr>
@@ -100,6 +106,7 @@
     </w:p>
     <w:p>
       <w:pPr>
+        <w:spacing w:before="0" w:after="80"/>
         <w:jc w:val="center"/>
         <w:spacing w:line="480" w:lineRule="auto"/>
       </w:pPr>
@@ -116,6 +123,7 @@
     </w:p>
     <w:p>
       <w:pPr>
+        <w:spacing w:before="0" w:after="80"/>
         <w:jc w:val="center"/>
         <w:spacing w:line="480" w:lineRule="auto"/>
       </w:pPr>
@@ -132,6 +140,7 @@
     </w:p>
     <w:p>
       <w:pPr>
+        <w:spacing w:before="0" w:after="80"/>
         <w:jc w:val="center"/>
         <w:spacing w:line="480" w:lineRule="auto"/>
       </w:pPr>
@@ -148,6 +157,7 @@
     </w:p>
     <w:p>
       <w:pPr>
+        <w:spacing w:before="480" w:after="80"/>
         <w:jc w:val="center"/>
         <w:spacing w:line="480" w:lineRule="auto"/>
       </w:pPr>
@@ -169,6 +179,7 @@
     </w:p>
     <w:p>
       <w:pPr>
+        <w:spacing w:before="240" w:after="120"/>
         <w:jc w:val="left"/>
         <w:spacing w:line="480" w:lineRule="auto"/>
       </w:pPr>
@@ -185,6 +196,7 @@
     </w:p>
     <w:p>
       <w:pPr>
+        <w:spacing w:before="0" w:after="240"/>
         <w:ind w:firstLine="720"/>
         <w:spacing w:line="480" w:lineRule="auto"/>
       </w:pPr>
@@ -215,12 +227,25 @@
       </w:r>
     </w:p>
     <w:p>
-      <w:r>
-        <w:br w:type="page"/>
+      <w:pPr>
+        <w:spacing w:before="240" w:after="120"/>
+        <w:jc w:val="left"/>
+        <w:spacing w:line="480" w:lineRule="auto"/>
+      </w:pPr>
+      <w:r>
+        <w:rPr>
+          <w:rFonts w:ascii="Times New Roman" w:hAnsi="Times New Roman"/>
+          <w:rFonts w:ascii="Times New Roman" w:hAnsi="Times New Roman"/>
+          <w:b/>
+          <w:i w:val="0"/>
+          <w:sz w:val="24"/>
+        </w:rPr>
+        <w:t>1. Introduction</w:t>
       </w:r>
     </w:p>
     <w:p>
       <w:pPr>
+        <w:spacing w:before="120" w:after="60"/>
         <w:jc w:val="left"/>
         <w:spacing w:line="480" w:lineRule="auto"/>
       </w:pPr>
@@ -229,30 +254,15 @@
           <w:rFonts w:ascii="Times New Roman" w:hAnsi="Times New Roman"/>
           <w:rFonts w:ascii="Times New Roman" w:hAnsi="Times New Roman"/>
           <w:b/>
-          <w:i w:val="0"/>
-          <w:sz w:val="24"/>
-        </w:rPr>
-        <w:t>1. Introduction</w:t>
+          <w:i/>
+          <w:sz w:val="24"/>
+        </w:rPr>
+        <w:t>1.1 Parental education level as a marker of early childhood environment</w:t>
       </w:r>
     </w:p>
     <w:p>
       <w:pPr>
-        <w:jc w:val="left"/>
-        <w:spacing w:line="480" w:lineRule="auto"/>
-      </w:pPr>
-      <w:r>
-        <w:rPr>
-          <w:rFonts w:ascii="Times New Roman" w:hAnsi="Times New Roman"/>
-          <w:rFonts w:ascii="Times New Roman" w:hAnsi="Times New Roman"/>
-          <w:b/>
-          <w:i/>
-          <w:sz w:val="24"/>
-        </w:rPr>
-        <w:t>1.1 Parental education level as a marker of early childhood environment</w:t>
-      </w:r>
-    </w:p>
-    <w:p>
-      <w:pPr>
+        <w:spacing w:before="0" w:after="0"/>
         <w:ind w:firstLine="720"/>
         <w:jc w:val="left"/>
         <w:spacing w:line="480" w:lineRule="auto"/>
@@ -270,6 +280,7 @@
     </w:p>
     <w:p>
       <w:pPr>
+        <w:spacing w:before="0" w:after="0"/>
         <w:ind w:firstLine="720"/>
         <w:jc w:val="left"/>
         <w:spacing w:line="480" w:lineRule="auto"/>
@@ -307,6 +318,7 @@
     </w:p>
     <w:p>
       <w:pPr>
+        <w:spacing w:before="120" w:after="60"/>
         <w:jc w:val="left"/>
         <w:spacing w:line="480" w:lineRule="auto"/>
       </w:pPr>
@@ -323,6 +335,7 @@
     </w:p>
     <w:p>
       <w:pPr>
+        <w:spacing w:before="0" w:after="0"/>
         <w:ind w:firstLine="720"/>
         <w:jc w:val="left"/>
         <w:spacing w:line="480" w:lineRule="auto"/>
@@ -340,6 +353,7 @@
     </w:p>
     <w:p>
       <w:pPr>
+        <w:spacing w:before="0" w:after="0"/>
         <w:ind w:firstLine="720"/>
         <w:jc w:val="left"/>
         <w:spacing w:line="480" w:lineRule="auto"/>
@@ -377,6 +391,7 @@
     </w:p>
     <w:p>
       <w:pPr>
+        <w:spacing w:before="120" w:after="60"/>
         <w:jc w:val="left"/>
         <w:spacing w:line="480" w:lineRule="auto"/>
       </w:pPr>
@@ -393,6 +408,7 @@
     </w:p>
     <w:p>
       <w:pPr>
+        <w:spacing w:before="0" w:after="0"/>
         <w:ind w:firstLine="720"/>
         <w:jc w:val="left"/>
         <w:spacing w:line="480" w:lineRule="auto"/>
@@ -410,6 +426,7 @@
     </w:p>
     <w:p>
       <w:pPr>
+        <w:spacing w:before="0" w:after="0"/>
         <w:ind w:firstLine="720"/>
         <w:jc w:val="left"/>
         <w:spacing w:line="480" w:lineRule="auto"/>
@@ -432,6 +449,7 @@
     </w:p>
     <w:p>
       <w:pPr>
+        <w:spacing w:before="240" w:after="120"/>
         <w:jc w:val="left"/>
         <w:spacing w:line="480" w:lineRule="auto"/>
       </w:pPr>
@@ -448,6 +466,7 @@
     </w:p>
     <w:p>
       <w:pPr>
+        <w:spacing w:before="120" w:after="60"/>
         <w:jc w:val="left"/>
         <w:spacing w:line="480" w:lineRule="auto"/>
       </w:pPr>
@@ -464,6 +483,7 @@
     </w:p>
     <w:p>
       <w:pPr>
+        <w:spacing w:before="0" w:after="0"/>
         <w:ind w:firstLine="720"/>
         <w:jc w:val="left"/>
         <w:spacing w:line="480" w:lineRule="auto"/>
@@ -481,6 +501,7 @@
     </w:p>
     <w:p>
       <w:pPr>
+        <w:spacing w:before="120" w:after="60"/>
         <w:jc w:val="left"/>
         <w:spacing w:line="480" w:lineRule="auto"/>
       </w:pPr>
@@ -497,6 +518,7 @@
     </w:p>
     <w:p>
       <w:pPr>
+        <w:spacing w:before="0" w:after="0"/>
         <w:ind w:firstLine="720"/>
         <w:jc w:val="left"/>
         <w:spacing w:line="480" w:lineRule="auto"/>
@@ -514,6 +536,7 @@
     </w:p>
     <w:p>
       <w:pPr>
+        <w:spacing w:before="0" w:after="0"/>
         <w:ind w:firstLine="720"/>
         <w:jc w:val="left"/>
         <w:spacing w:line="480" w:lineRule="auto"/>
@@ -541,6 +564,7 @@
     </w:p>
     <w:p>
       <w:pPr>
+        <w:spacing w:before="0" w:after="0"/>
         <w:ind w:firstLine="720"/>
         <w:jc w:val="left"/>
         <w:spacing w:line="480" w:lineRule="auto"/>
@@ -588,6 +612,7 @@
     </w:p>
     <w:p>
       <w:pPr>
+        <w:spacing w:before="0" w:after="0"/>
         <w:ind w:firstLine="720"/>
         <w:jc w:val="left"/>
         <w:spacing w:line="480" w:lineRule="auto"/>
@@ -615,6 +640,7 @@
     </w:p>
     <w:p>
       <w:pPr>
+        <w:spacing w:before="0" w:after="0"/>
         <w:ind w:firstLine="720"/>
         <w:jc w:val="left"/>
         <w:spacing w:line="480" w:lineRule="auto"/>
@@ -642,6 +668,7 @@
     </w:p>
     <w:p>
       <w:pPr>
+        <w:spacing w:before="0" w:after="0"/>
         <w:ind w:firstLine="720"/>
         <w:jc w:val="left"/>
         <w:spacing w:line="480" w:lineRule="auto"/>
@@ -669,6 +696,7 @@
     </w:p>
     <w:p>
       <w:pPr>
+        <w:spacing w:before="120" w:after="60"/>
         <w:jc w:val="left"/>
         <w:spacing w:line="480" w:lineRule="auto"/>
       </w:pPr>
@@ -685,6 +713,7 @@
     </w:p>
     <w:p>
       <w:pPr>
+        <w:spacing w:before="0" w:after="0"/>
         <w:ind w:firstLine="720"/>
         <w:jc w:val="left"/>
         <w:spacing w:line="480" w:lineRule="auto"/>
@@ -702,6 +731,7 @@
     </w:p>
     <w:p>
       <w:pPr>
+        <w:spacing w:before="0" w:after="0"/>
         <w:ind w:firstLine="720"/>
         <w:jc w:val="left"/>
         <w:spacing w:line="480" w:lineRule="auto"/>
@@ -719,6 +749,7 @@
     </w:p>
     <w:p>
       <w:pPr>
+        <w:spacing w:before="60" w:after="60"/>
         <w:ind w:left="720" w:right="720"/>
         <w:spacing w:line="480" w:lineRule="auto"/>
       </w:pPr>
@@ -735,6 +766,7 @@
     </w:p>
     <w:p>
       <w:pPr>
+        <w:spacing w:before="0" w:after="0"/>
         <w:ind w:firstLine="720"/>
         <w:jc w:val="left"/>
         <w:spacing w:line="480" w:lineRule="auto"/>
@@ -752,6 +784,7 @@
     </w:p>
     <w:p>
       <w:pPr>
+        <w:spacing w:before="120" w:after="60"/>
         <w:jc w:val="left"/>
         <w:spacing w:line="480" w:lineRule="auto"/>
       </w:pPr>
@@ -768,6 +801,7 @@
     </w:p>
     <w:p>
       <w:pPr>
+        <w:spacing w:before="0" w:after="0"/>
         <w:ind w:firstLine="720"/>
         <w:jc w:val="left"/>
         <w:spacing w:line="480" w:lineRule="auto"/>
@@ -785,6 +819,7 @@
     </w:p>
     <w:p>
       <w:pPr>
+        <w:spacing w:before="0" w:after="0"/>
         <w:ind w:firstLine="720"/>
         <w:jc w:val="left"/>
         <w:spacing w:line="480" w:lineRule="auto"/>
@@ -802,6 +837,7 @@
     </w:p>
     <w:p>
       <w:pPr>
+        <w:spacing w:before="0" w:after="0"/>
         <w:ind w:firstLine="720"/>
         <w:jc w:val="left"/>
         <w:spacing w:line="480" w:lineRule="auto"/>
@@ -869,6 +905,7 @@
     </w:p>
     <w:p>
       <w:pPr>
+        <w:spacing w:before="0" w:after="0"/>
         <w:ind w:firstLine="720"/>
         <w:jc w:val="left"/>
         <w:spacing w:line="480" w:lineRule="auto"/>
@@ -896,6 +933,7 @@
     </w:p>
     <w:p>
       <w:pPr>
+        <w:spacing w:before="0" w:after="0"/>
         <w:ind w:firstLine="720"/>
         <w:jc w:val="left"/>
         <w:spacing w:line="480" w:lineRule="auto"/>
@@ -1023,6 +1061,7 @@
     </w:p>
     <w:p>
       <w:pPr>
+        <w:spacing w:before="120" w:after="60"/>
         <w:jc w:val="left"/>
         <w:spacing w:line="480" w:lineRule="auto"/>
       </w:pPr>
@@ -1039,6 +1078,7 @@
     </w:p>
     <w:p>
       <w:pPr>
+        <w:spacing w:before="0" w:after="0"/>
         <w:ind w:firstLine="720"/>
         <w:jc w:val="left"/>
         <w:spacing w:line="480" w:lineRule="auto"/>
@@ -1056,6 +1096,7 @@
     </w:p>
     <w:p>
       <w:pPr>
+        <w:spacing w:before="120" w:after="60"/>
         <w:jc w:val="left"/>
         <w:spacing w:line="480" w:lineRule="auto"/>
       </w:pPr>
@@ -1072,6 +1113,7 @@
     </w:p>
     <w:p>
       <w:pPr>
+        <w:spacing w:before="0" w:after="0"/>
         <w:ind w:firstLine="720"/>
         <w:jc w:val="left"/>
         <w:spacing w:line="480" w:lineRule="auto"/>
@@ -1089,6 +1131,7 @@
     </w:p>
     <w:p>
       <w:pPr>
+        <w:spacing w:before="120" w:after="60"/>
         <w:jc w:val="left"/>
         <w:spacing w:line="480" w:lineRule="auto"/>
       </w:pPr>
@@ -1105,6 +1148,7 @@
     </w:p>
     <w:p>
       <w:pPr>
+        <w:spacing w:before="0" w:after="0"/>
         <w:ind w:firstLine="720"/>
         <w:jc w:val="left"/>
         <w:spacing w:line="480" w:lineRule="auto"/>
@@ -1127,6 +1171,7 @@
     </w:p>
     <w:p>
       <w:pPr>
+        <w:spacing w:before="240" w:after="120"/>
         <w:jc w:val="left"/>
         <w:spacing w:line="480" w:lineRule="auto"/>
       </w:pPr>
@@ -1143,6 +1188,7 @@
     </w:p>
     <w:p>
       <w:pPr>
+        <w:spacing w:before="120" w:after="60"/>
         <w:jc w:val="left"/>
         <w:spacing w:line="480" w:lineRule="auto"/>
       </w:pPr>
@@ -1159,6 +1205,7 @@
     </w:p>
     <w:p>
       <w:pPr>
+        <w:spacing w:before="0" w:after="0"/>
         <w:ind w:firstLine="720"/>
         <w:jc w:val="left"/>
         <w:spacing w:line="480" w:lineRule="auto"/>
@@ -1256,6 +1303,7 @@
     </w:p>
     <w:p>
       <w:pPr>
+        <w:spacing w:before="0" w:after="0"/>
         <w:ind w:firstLine="720"/>
         <w:jc w:val="left"/>
         <w:spacing w:line="480" w:lineRule="auto"/>
@@ -1393,6 +1441,7 @@
     </w:p>
     <w:p>
       <w:pPr>
+        <w:spacing w:before="0" w:after="0"/>
         <w:ind w:firstLine="720"/>
         <w:jc w:val="left"/>
         <w:spacing w:line="480" w:lineRule="auto"/>
@@ -1470,6 +1519,7 @@
     </w:p>
     <w:p>
       <w:pPr>
+        <w:spacing w:before="0" w:after="0"/>
         <w:ind w:firstLine="720"/>
         <w:jc w:val="left"/>
         <w:spacing w:line="480" w:lineRule="auto"/>
@@ -1507,6 +1557,7 @@
     </w:p>
     <w:p>
       <w:pPr>
+        <w:spacing w:before="0" w:after="0"/>
         <w:ind w:firstLine="720"/>
         <w:jc w:val="left"/>
         <w:spacing w:line="480" w:lineRule="auto"/>
@@ -6055,7 +6106,7 @@
         <w:rPr>
           <w:rFonts w:ascii="Times New Roman" w:hAnsi="Times New Roman"/>
           <w:rFonts w:ascii="Times New Roman" w:hAnsi="Times New Roman"/>
-          <w:b/>
+          <w:b w:val="0"/>
           <w:i/>
           <w:sz w:val="20"/>
         </w:rPr>
@@ -6094,6 +6145,7 @@
     </w:p>
     <w:p>
       <w:pPr>
+        <w:spacing w:before="120" w:after="60"/>
         <w:jc w:val="left"/>
         <w:spacing w:line="480" w:lineRule="auto"/>
       </w:pPr>
@@ -6110,6 +6162,7 @@
     </w:p>
     <w:p>
       <w:pPr>
+        <w:spacing w:before="0" w:after="0"/>
         <w:ind w:firstLine="720"/>
         <w:jc w:val="left"/>
         <w:spacing w:line="480" w:lineRule="auto"/>
@@ -6127,6 +6180,7 @@
     </w:p>
     <w:p>
       <w:pPr>
+        <w:spacing w:before="120" w:after="60"/>
         <w:jc w:val="left"/>
         <w:spacing w:line="480" w:lineRule="auto"/>
       </w:pPr>
@@ -6143,6 +6197,7 @@
     </w:p>
     <w:p>
       <w:pPr>
+        <w:spacing w:before="0" w:after="0"/>
         <w:ind w:firstLine="720"/>
         <w:jc w:val="left"/>
         <w:spacing w:line="480" w:lineRule="auto"/>
@@ -6160,6 +6215,7 @@
     </w:p>
     <w:p>
       <w:pPr>
+        <w:spacing w:before="120" w:after="60"/>
         <w:jc w:val="left"/>
         <w:spacing w:line="480" w:lineRule="auto"/>
       </w:pPr>
@@ -6176,6 +6232,7 @@
     </w:p>
     <w:p>
       <w:pPr>
+        <w:spacing w:before="0" w:after="0"/>
         <w:ind w:firstLine="720"/>
         <w:jc w:val="left"/>
         <w:spacing w:line="480" w:lineRule="auto"/>
@@ -6243,6 +6300,7 @@
     </w:p>
     <w:p>
       <w:pPr>
+        <w:spacing w:before="0" w:after="0"/>
         <w:ind w:firstLine="720"/>
         <w:jc w:val="left"/>
         <w:spacing w:line="480" w:lineRule="auto"/>
@@ -6390,6 +6448,7 @@
     </w:p>
     <w:p>
       <w:pPr>
+        <w:spacing w:before="0" w:after="0"/>
         <w:ind w:firstLine="720"/>
         <w:jc w:val="left"/>
         <w:spacing w:line="480" w:lineRule="auto"/>
@@ -6457,6 +6516,7 @@
     </w:p>
     <w:p>
       <w:pPr>
+        <w:spacing w:before="0" w:after="0"/>
         <w:ind w:firstLine="720"/>
         <w:jc w:val="left"/>
         <w:spacing w:line="480" w:lineRule="auto"/>
@@ -6474,6 +6534,7 @@
     </w:p>
     <w:p>
       <w:pPr>
+        <w:spacing w:before="120" w:after="60"/>
         <w:jc w:val="left"/>
         <w:spacing w:line="480" w:lineRule="auto"/>
       </w:pPr>
@@ -6490,6 +6551,7 @@
     </w:p>
     <w:p>
       <w:pPr>
+        <w:spacing w:before="0" w:after="0"/>
         <w:ind w:firstLine="720"/>
         <w:jc w:val="left"/>
         <w:spacing w:line="480" w:lineRule="auto"/>
@@ -6577,6 +6639,7 @@
     </w:p>
     <w:p>
       <w:pPr>
+        <w:spacing w:before="0" w:after="0"/>
         <w:ind w:firstLine="720"/>
         <w:jc w:val="left"/>
         <w:spacing w:line="480" w:lineRule="auto"/>
@@ -6664,6 +6727,7 @@
     </w:p>
     <w:p>
       <w:pPr>
+        <w:spacing w:before="120" w:after="60"/>
         <w:jc w:val="left"/>
         <w:spacing w:line="480" w:lineRule="auto"/>
       </w:pPr>
@@ -6680,6 +6744,7 @@
     </w:p>
     <w:p>
       <w:pPr>
+        <w:spacing w:before="0" w:after="0"/>
         <w:ind w:firstLine="720"/>
         <w:jc w:val="left"/>
         <w:spacing w:line="480" w:lineRule="auto"/>
@@ -6697,6 +6762,7 @@
     </w:p>
     <w:p>
       <w:pPr>
+        <w:spacing w:before="0" w:after="0"/>
         <w:ind w:firstLine="720"/>
         <w:jc w:val="left"/>
         <w:spacing w:line="480" w:lineRule="auto"/>
@@ -6784,6 +6850,7 @@
     </w:p>
     <w:p>
       <w:pPr>
+        <w:spacing w:before="120" w:after="60"/>
         <w:jc w:val="left"/>
         <w:spacing w:line="480" w:lineRule="auto"/>
       </w:pPr>
@@ -6800,6 +6867,7 @@
     </w:p>
     <w:p>
       <w:pPr>
+        <w:spacing w:before="0" w:after="0"/>
         <w:ind w:firstLine="720"/>
         <w:jc w:val="left"/>
         <w:spacing w:line="480" w:lineRule="auto"/>
@@ -6817,6 +6885,7 @@
     </w:p>
     <w:p>
       <w:pPr>
+        <w:spacing w:before="120" w:after="60"/>
         <w:jc w:val="left"/>
         <w:spacing w:line="480" w:lineRule="auto"/>
       </w:pPr>
@@ -6833,6 +6902,7 @@
     </w:p>
     <w:p>
       <w:pPr>
+        <w:spacing w:before="0" w:after="0"/>
         <w:ind w:firstLine="720"/>
         <w:jc w:val="left"/>
         <w:spacing w:line="480" w:lineRule="auto"/>
@@ -6850,6 +6920,7 @@
     </w:p>
     <w:p>
       <w:pPr>
+        <w:spacing w:before="0" w:after="0"/>
         <w:ind w:firstLine="720"/>
         <w:jc w:val="left"/>
         <w:spacing w:line="480" w:lineRule="auto"/>
@@ -6917,6 +6988,7 @@
     </w:p>
     <w:p>
       <w:pPr>
+        <w:spacing w:before="0" w:after="0"/>
         <w:ind w:firstLine="720"/>
         <w:jc w:val="left"/>
         <w:spacing w:line="480" w:lineRule="auto"/>
@@ -6964,6 +7036,7 @@
     </w:p>
     <w:p>
       <w:pPr>
+        <w:spacing w:before="0" w:after="0"/>
         <w:ind w:firstLine="720"/>
         <w:jc w:val="left"/>
         <w:spacing w:line="480" w:lineRule="auto"/>
@@ -7011,6 +7084,7 @@
     </w:p>
     <w:p>
       <w:pPr>
+        <w:spacing w:before="0" w:after="0"/>
         <w:ind w:firstLine="720"/>
         <w:jc w:val="left"/>
         <w:spacing w:line="480" w:lineRule="auto"/>
@@ -7078,6 +7152,7 @@
     </w:p>
     <w:p>
       <w:pPr>
+        <w:spacing w:before="0" w:after="0"/>
         <w:ind w:firstLine="720"/>
         <w:jc w:val="left"/>
         <w:spacing w:line="480" w:lineRule="auto"/>
@@ -7135,6 +7210,7 @@
     </w:p>
     <w:p>
       <w:pPr>
+        <w:spacing w:before="120" w:after="60"/>
         <w:jc w:val="left"/>
         <w:spacing w:line="480" w:lineRule="auto"/>
       </w:pPr>
@@ -7151,6 +7227,7 @@
     </w:p>
     <w:p>
       <w:pPr>
+        <w:spacing w:before="0" w:after="0"/>
         <w:ind w:firstLine="720"/>
         <w:jc w:val="left"/>
         <w:spacing w:line="480" w:lineRule="auto"/>
@@ -7168,6 +7245,7 @@
     </w:p>
     <w:p>
       <w:pPr>
+        <w:spacing w:before="0" w:after="0"/>
         <w:ind w:firstLine="720"/>
         <w:jc w:val="left"/>
         <w:spacing w:line="480" w:lineRule="auto"/>
@@ -7195,6 +7273,7 @@
     </w:p>
     <w:p>
       <w:pPr>
+        <w:spacing w:before="0" w:after="0"/>
         <w:ind w:firstLine="720"/>
         <w:jc w:val="left"/>
         <w:spacing w:line="480" w:lineRule="auto"/>
@@ -7262,6 +7341,7 @@
     </w:p>
     <w:p>
       <w:pPr>
+        <w:spacing w:before="120" w:after="60"/>
         <w:jc w:val="left"/>
         <w:spacing w:line="480" w:lineRule="auto"/>
       </w:pPr>
@@ -7278,6 +7358,7 @@
     </w:p>
     <w:p>
       <w:pPr>
+        <w:spacing w:before="0" w:after="0"/>
         <w:ind w:firstLine="720"/>
         <w:jc w:val="left"/>
         <w:spacing w:line="480" w:lineRule="auto"/>
@@ -7295,6 +7376,7 @@
     </w:p>
     <w:p>
       <w:pPr>
+        <w:spacing w:before="0" w:after="0"/>
         <w:ind w:firstLine="720"/>
         <w:jc w:val="left"/>
         <w:spacing w:line="480" w:lineRule="auto"/>
@@ -7362,6 +7444,7 @@
     </w:p>
     <w:p>
       <w:pPr>
+        <w:spacing w:before="0" w:after="0"/>
         <w:ind w:firstLine="720"/>
         <w:jc w:val="left"/>
         <w:spacing w:line="480" w:lineRule="auto"/>
@@ -7449,6 +7532,7 @@
     </w:p>
     <w:p>
       <w:pPr>
+        <w:spacing w:before="0" w:after="0"/>
         <w:ind w:firstLine="720"/>
         <w:jc w:val="left"/>
         <w:spacing w:line="480" w:lineRule="auto"/>
@@ -7496,6 +7580,7 @@
     </w:p>
     <w:p>
       <w:pPr>
+        <w:spacing w:before="0" w:after="0"/>
         <w:ind w:firstLine="720"/>
         <w:jc w:val="left"/>
         <w:spacing w:line="480" w:lineRule="auto"/>
@@ -7513,6 +7598,7 @@
     </w:p>
     <w:p>
       <w:pPr>
+        <w:spacing w:before="120" w:after="60"/>
         <w:jc w:val="left"/>
         <w:spacing w:line="480" w:lineRule="auto"/>
       </w:pPr>
@@ -7529,6 +7615,7 @@
     </w:p>
     <w:p>
       <w:pPr>
+        <w:spacing w:before="0" w:after="0"/>
         <w:ind w:firstLine="720"/>
         <w:jc w:val="left"/>
         <w:spacing w:line="480" w:lineRule="auto"/>
@@ -7546,6 +7633,7 @@
     </w:p>
     <w:p>
       <w:pPr>
+        <w:spacing w:before="120" w:after="60"/>
         <w:jc w:val="left"/>
         <w:spacing w:line="480" w:lineRule="auto"/>
       </w:pPr>
@@ -7562,6 +7650,7 @@
     </w:p>
     <w:p>
       <w:pPr>
+        <w:spacing w:before="0" w:after="0"/>
         <w:ind w:firstLine="720"/>
         <w:jc w:val="left"/>
         <w:spacing w:line="480" w:lineRule="auto"/>
@@ -7579,6 +7668,7 @@
     </w:p>
     <w:p>
       <w:pPr>
+        <w:spacing w:before="0" w:after="0"/>
         <w:ind w:firstLine="720"/>
         <w:jc w:val="left"/>
         <w:spacing w:line="480" w:lineRule="auto"/>
@@ -7596,6 +7686,7 @@
     </w:p>
     <w:p>
       <w:pPr>
+        <w:spacing w:before="0" w:after="0"/>
         <w:ind w:firstLine="720"/>
         <w:jc w:val="left"/>
         <w:spacing w:line="480" w:lineRule="auto"/>
@@ -7613,6 +7704,7 @@
     </w:p>
     <w:p>
       <w:pPr>
+        <w:spacing w:before="120" w:after="60"/>
         <w:jc w:val="left"/>
         <w:spacing w:line="480" w:lineRule="auto"/>
       </w:pPr>
@@ -7629,6 +7721,7 @@
     </w:p>
     <w:p>
       <w:pPr>
+        <w:spacing w:before="0" w:after="0"/>
         <w:ind w:firstLine="720"/>
         <w:jc w:val="left"/>
         <w:spacing w:line="480" w:lineRule="auto"/>
@@ -7646,6 +7739,7 @@
     </w:p>
     <w:p>
       <w:pPr>
+        <w:spacing w:before="0" w:after="0"/>
         <w:ind w:firstLine="720"/>
         <w:jc w:val="left"/>
         <w:spacing w:line="480" w:lineRule="auto"/>
@@ -7683,6 +7777,7 @@
     </w:p>
     <w:p>
       <w:pPr>
+        <w:spacing w:before="0" w:after="0"/>
         <w:ind w:firstLine="720"/>
         <w:jc w:val="left"/>
         <w:spacing w:line="480" w:lineRule="auto"/>
@@ -7700,6 +7795,7 @@
     </w:p>
     <w:p>
       <w:pPr>
+        <w:spacing w:before="120" w:after="60"/>
         <w:jc w:val="left"/>
         <w:spacing w:line="480" w:lineRule="auto"/>
       </w:pPr>
@@ -7716,6 +7812,7 @@
     </w:p>
     <w:p>
       <w:pPr>
+        <w:spacing w:before="0" w:after="0"/>
         <w:ind w:firstLine="720"/>
         <w:jc w:val="left"/>
         <w:spacing w:line="480" w:lineRule="auto"/>
@@ -7733,6 +7830,7 @@
     </w:p>
     <w:p>
       <w:pPr>
+        <w:spacing w:before="0" w:after="0"/>
         <w:ind w:firstLine="720"/>
         <w:jc w:val="left"/>
         <w:spacing w:line="480" w:lineRule="auto"/>
@@ -7755,6 +7853,7 @@
     </w:p>
     <w:p>
       <w:pPr>
+        <w:spacing w:before="240" w:after="120"/>
         <w:jc w:val="left"/>
         <w:spacing w:line="480" w:lineRule="auto"/>
       </w:pPr>
@@ -7771,6 +7870,7 @@
     </w:p>
     <w:p>
       <w:pPr>
+        <w:spacing w:before="120" w:after="60"/>
         <w:jc w:val="left"/>
         <w:spacing w:line="480" w:lineRule="auto"/>
       </w:pPr>
@@ -7787,6 +7887,7 @@
     </w:p>
     <w:p>
       <w:pPr>
+        <w:spacing w:before="0" w:after="0"/>
         <w:ind w:firstLine="720"/>
         <w:jc w:val="left"/>
         <w:spacing w:line="480" w:lineRule="auto"/>
@@ -7804,6 +7905,7 @@
     </w:p>
     <w:p>
       <w:pPr>
+        <w:spacing w:before="0" w:after="0"/>
         <w:ind w:firstLine="720"/>
         <w:jc w:val="left"/>
         <w:spacing w:line="480" w:lineRule="auto"/>
@@ -7821,6 +7923,7 @@
     </w:p>
     <w:p>
       <w:pPr>
+        <w:spacing w:before="0" w:after="0"/>
         <w:ind w:firstLine="720"/>
         <w:jc w:val="left"/>
         <w:spacing w:line="480" w:lineRule="auto"/>
@@ -7858,6 +7961,7 @@
     </w:p>
     <w:p>
       <w:pPr>
+        <w:spacing w:before="0" w:after="0"/>
         <w:ind w:firstLine="720"/>
         <w:jc w:val="left"/>
         <w:spacing w:line="480" w:lineRule="auto"/>
@@ -7875,6 +7979,7 @@
     </w:p>
     <w:p>
       <w:pPr>
+        <w:spacing w:before="120" w:after="60"/>
         <w:jc w:val="left"/>
         <w:spacing w:line="480" w:lineRule="auto"/>
       </w:pPr>
@@ -7891,6 +7996,7 @@
     </w:p>
     <w:p>
       <w:pPr>
+        <w:spacing w:before="0" w:after="0"/>
         <w:ind w:firstLine="720"/>
         <w:jc w:val="left"/>
         <w:spacing w:line="480" w:lineRule="auto"/>
@@ -7928,6 +8034,7 @@
     </w:p>
     <w:p>
       <w:pPr>
+        <w:spacing w:before="0" w:after="0"/>
         <w:ind w:firstLine="720"/>
         <w:jc w:val="left"/>
         <w:spacing w:line="480" w:lineRule="auto"/>
@@ -7945,6 +8052,7 @@
     </w:p>
     <w:p>
       <w:pPr>
+        <w:spacing w:before="120" w:after="60"/>
         <w:jc w:val="left"/>
         <w:spacing w:line="480" w:lineRule="auto"/>
       </w:pPr>
@@ -7961,6 +8069,7 @@
     </w:p>
     <w:p>
       <w:pPr>
+        <w:spacing w:before="0" w:after="0"/>
         <w:ind w:firstLine="720"/>
         <w:jc w:val="left"/>
         <w:spacing w:line="480" w:lineRule="auto"/>
@@ -7978,6 +8087,7 @@
     </w:p>
     <w:p>
       <w:pPr>
+        <w:spacing w:before="0" w:after="0"/>
         <w:ind w:firstLine="720"/>
         <w:jc w:val="left"/>
         <w:spacing w:line="480" w:lineRule="auto"/>
@@ -7995,6 +8105,7 @@
     </w:p>
     <w:p>
       <w:pPr>
+        <w:spacing w:before="120" w:after="60"/>
         <w:jc w:val="left"/>
         <w:spacing w:line="480" w:lineRule="auto"/>
       </w:pPr>
@@ -8011,6 +8122,7 @@
     </w:p>
     <w:p>
       <w:pPr>
+        <w:spacing w:before="0" w:after="0"/>
         <w:ind w:firstLine="720"/>
         <w:jc w:val="left"/>
         <w:spacing w:line="480" w:lineRule="auto"/>
@@ -8028,6 +8140,7 @@
     </w:p>
     <w:p>
       <w:pPr>
+        <w:spacing w:before="0" w:after="0"/>
         <w:ind w:firstLine="720"/>
         <w:jc w:val="left"/>
         <w:spacing w:line="480" w:lineRule="auto"/>
@@ -8055,6 +8168,7 @@
     </w:p>
     <w:p>
       <w:pPr>
+        <w:spacing w:before="0" w:after="0"/>
         <w:ind w:firstLine="720"/>
         <w:jc w:val="left"/>
         <w:spacing w:line="480" w:lineRule="auto"/>
@@ -8082,6 +8196,7 @@
     </w:p>
     <w:p>
       <w:pPr>
+        <w:spacing w:before="0" w:after="0"/>
         <w:ind w:firstLine="720"/>
         <w:jc w:val="left"/>
         <w:spacing w:line="480" w:lineRule="auto"/>
@@ -8109,6 +8224,7 @@
     </w:p>
     <w:p>
       <w:pPr>
+        <w:spacing w:before="0" w:after="0"/>
         <w:ind w:firstLine="720"/>
         <w:jc w:val="left"/>
         <w:spacing w:line="480" w:lineRule="auto"/>
@@ -8196,6 +8312,7 @@
     </w:p>
     <w:p>
       <w:pPr>
+        <w:spacing w:before="0" w:after="0"/>
         <w:ind w:firstLine="720"/>
         <w:jc w:val="left"/>
         <w:spacing w:line="480" w:lineRule="auto"/>
@@ -8223,6 +8340,7 @@
     </w:p>
     <w:p>
       <w:pPr>
+        <w:spacing w:before="0" w:after="0"/>
         <w:ind w:firstLine="720"/>
         <w:jc w:val="left"/>
         <w:spacing w:line="480" w:lineRule="auto"/>
@@ -8240,6 +8358,7 @@
     </w:p>
     <w:p>
       <w:pPr>
+        <w:spacing w:before="120" w:after="60"/>
         <w:jc w:val="left"/>
         <w:spacing w:line="480" w:lineRule="auto"/>
       </w:pPr>
@@ -8256,6 +8375,7 @@
     </w:p>
     <w:p>
       <w:pPr>
+        <w:spacing w:before="0" w:after="0"/>
         <w:ind w:firstLine="720"/>
         <w:jc w:val="left"/>
         <w:spacing w:line="480" w:lineRule="auto"/>
@@ -8293,6 +8413,7 @@
     </w:p>
     <w:p>
       <w:pPr>
+        <w:spacing w:before="0" w:after="0"/>
         <w:ind w:firstLine="720"/>
         <w:jc w:val="left"/>
         <w:spacing w:line="480" w:lineRule="auto"/>
@@ -8315,6 +8436,7 @@
     </w:p>
     <w:p>
       <w:pPr>
+        <w:spacing w:before="240" w:after="120"/>
         <w:jc w:val="left"/>
         <w:spacing w:line="480" w:lineRule="auto"/>
       </w:pPr>
@@ -10519,6 +10641,7 @@
     </w:p>
     <w:p>
       <w:pPr>
+        <w:spacing w:before="240" w:after="120"/>
         <w:jc w:val="left"/>
         <w:spacing w:line="480" w:lineRule="auto"/>
       </w:pPr>
@@ -10535,6 +10658,7 @@
     </w:p>
     <w:p>
       <w:pPr>
+        <w:spacing w:before="120" w:after="0"/>
         <w:spacing w:line="480" w:lineRule="auto"/>
       </w:pPr>
       <w:r>
@@ -10560,6 +10684,7 @@
     </w:p>
     <w:p>
       <w:pPr>
+        <w:spacing w:before="120" w:after="0"/>
         <w:spacing w:line="480" w:lineRule="auto"/>
       </w:pPr>
       <w:r>
@@ -10585,6 +10710,7 @@
     </w:p>
     <w:p>
       <w:pPr>
+        <w:spacing w:before="120" w:after="0"/>
         <w:spacing w:line="480" w:lineRule="auto"/>
       </w:pPr>
       <w:r>
@@ -10610,6 +10736,7 @@
     </w:p>
     <w:p>
       <w:pPr>
+        <w:spacing w:before="120" w:after="0"/>
         <w:spacing w:line="480" w:lineRule="auto"/>
       </w:pPr>
       <w:r>
@@ -14989,7 +15116,7 @@
         <w:rPr>
           <w:rFonts w:ascii="Times New Roman" w:hAnsi="Times New Roman"/>
           <w:rFonts w:ascii="Times New Roman" w:hAnsi="Times New Roman"/>
-          <w:b/>
+          <w:b w:val="0"/>
           <w:i/>
           <w:sz w:val="20"/>
         </w:rPr>
@@ -15403,9 +15530,6 @@
     <w:name w:val="Normal"/>
     <w:qFormat/>
     <w:rsid w:val="00FC693F"/>
-    <w:pPr>
-      <w:spacing w:line="480" w:lineRule="auto" w:after="0"/>
-    </w:pPr>
     <w:rPr>
       <w:rFonts w:ascii="Times New Roman" w:hAnsi="Times New Roman"/>
       <w:sz w:val="24"/>

</xml_diff>